<commit_message>
Aggiunta Correction 4 (bibliografia rinumerata + mapping citazioni)
- Rimossa voce orfana [32] (Bouchaud & Potters)
- Riformattate tutte le 39 voci in stile MDPI Electronics (italico/bold/punti finali/accessed-on date)
- Tabella mapping P40/P66/P94/P129/P182 per le 6 sostituzioni in-text (refs 33-40 -> 32-39)
- Voci con DOI mancanti taggate "[DOI da verificare]"

https://claude.ai/code/session_01FJZ2GxeVHuBQqzR4Ntpx7e
</commit_message>
<xml_diff>
--- a/Eletronics/corrections/MRQF_MAS_Corrections_TODO.docx
+++ b/Eletronics/corrections/MRQF_MAS_Corrections_TODO.docx
@@ -541,6 +541,1540 @@
       </w:pPr>
       <w:r>
         <w:t>5. Verify that all paragraphs use the MDPI_3.1_text style and that no formatting marks remain from the original placeholders.</w:t>
+      </w:r>
+    </w:p>
+    <w:p>
+      <w:pPr>
+        <w:pStyle w:val="MDPI19line"/>
+      </w:pPr>
+    </w:p>
+    <w:p>
+      <w:pPr>
+        <w:pStyle w:val="MDPI21heading1"/>
+      </w:pPr>
+      <w:r>
+        <w:t>Correction 4. References — full rewrite (40 → 39) and in-text renumbering</w:t>
+      </w:r>
+    </w:p>
+    <w:p>
+      <w:pPr>
+        <w:pStyle w:val="MDPI31text"/>
+      </w:pPr>
+      <w:r>
+        <w:rPr>
+          <w:b/>
+        </w:rPr>
+        <w:t xml:space="preserve">Background. </w:t>
+      </w:r>
+      <w:r>
+        <w:t>Reference [32] (Bouchaud, J.-P.; Potters, M., Theory of Financial Risk and Derivative Pricing) is fully orphan in the manuscript: it is not cited as [32] anywhere and the only collective range that nominally includes it ([31–33] in P40) reduces to [31,32] after removal. All references after [32] shift down by one (old [33–40] → new [32–39]). The list is also cleaned of formatting issues flagged by the structural review: missing terminal periods in old [10], [18], [23]; missing accessed-on date in old [35]; truncated venue line in old [23]; missing DOIs flagged where unverified.</w:t>
+      </w:r>
+    </w:p>
+    <w:p>
+      <w:pPr>
+        <w:pStyle w:val="MDPI31text"/>
+      </w:pPr>
+      <w:r>
+        <w:rPr>
+          <w:b/>
+        </w:rPr>
+        <w:t xml:space="preserve">Action 4.A — Replace the entire References section. </w:t>
+      </w:r>
+      <w:r>
+        <w:t xml:space="preserve">In the source manuscript, locate the heading </w:t>
+      </w:r>
+      <w:r>
+        <w:rPr>
+          <w:i/>
+        </w:rPr>
+        <w:t>References</w:t>
+      </w:r>
+      <w:r>
+        <w:t xml:space="preserve"> (P219) and the 40 numbered entries that follow (P220–P259). REMOVE all 40 entries and REPLACE them with the 39 entries below. Each entry must use the paragraph style </w:t>
+      </w:r>
+      <w:r>
+        <w:rPr>
+          <w:i/>
+        </w:rPr>
+        <w:t>MDPI_8.1_references</w:t>
+      </w:r>
+      <w:r>
+        <w:t>. Italics and bold formatting are already applied in this companion file (journal name in italics, year in bold, volume in italics) and can be copied verbatim.</w:t>
+      </w:r>
+    </w:p>
+    <w:p>
+      <w:pPr>
+        <w:pStyle w:val="MDPI22heading2"/>
+      </w:pPr>
+      <w:r>
+        <w:t>4.A. New References list (39 entries — replaces all old [1]–[40])</w:t>
+      </w:r>
+    </w:p>
+    <w:p>
+      <w:pPr>
+        <w:pStyle w:val="MDPI81references"/>
+      </w:pPr>
+      <w:r>
+        <w:t>1.</w:t>
+        <w:tab/>
+        <w:t xml:space="preserve">Bachelier, L. Théorie de la spéculation. </w:t>
+      </w:r>
+      <w:r>
+        <w:rPr>
+          <w:i/>
+        </w:rPr>
+        <w:t>Ann. Sci. École Norm. Sup.</w:t>
+      </w:r>
+      <w:r>
+        <w:t xml:space="preserve"> </w:t>
+      </w:r>
+      <w:r>
+        <w:rPr>
+          <w:b/>
+        </w:rPr>
+        <w:t>1900</w:t>
+      </w:r>
+      <w:r>
+        <w:t xml:space="preserve">, </w:t>
+      </w:r>
+      <w:r>
+        <w:rPr>
+          <w:i/>
+        </w:rPr>
+        <w:t>17</w:t>
+      </w:r>
+      <w:r>
+        <w:t>, 21–86. https://doi.org/10.24033/asens.476.</w:t>
+      </w:r>
+    </w:p>
+    <w:p>
+      <w:pPr>
+        <w:pStyle w:val="MDPI81references"/>
+      </w:pPr>
+      <w:r>
+        <w:t>2.</w:t>
+        <w:tab/>
+        <w:t xml:space="preserve">Mandelbrot, B.B. The variation of certain speculative prices. </w:t>
+      </w:r>
+      <w:r>
+        <w:rPr>
+          <w:i/>
+        </w:rPr>
+        <w:t>J. Bus.</w:t>
+      </w:r>
+      <w:r>
+        <w:t xml:space="preserve"> </w:t>
+      </w:r>
+      <w:r>
+        <w:rPr>
+          <w:b/>
+        </w:rPr>
+        <w:t>1963</w:t>
+      </w:r>
+      <w:r>
+        <w:t xml:space="preserve">, </w:t>
+      </w:r>
+      <w:r>
+        <w:rPr>
+          <w:i/>
+        </w:rPr>
+        <w:t>36</w:t>
+      </w:r>
+      <w:r>
+        <w:t>, 394–419. https://doi.org/10.1086/294632.</w:t>
+      </w:r>
+    </w:p>
+    <w:p>
+      <w:pPr>
+        <w:pStyle w:val="MDPI81references"/>
+      </w:pPr>
+      <w:r>
+        <w:t>3.</w:t>
+        <w:tab/>
+        <w:t>Mandelbrot, B.B. Fractals and Scaling in Finance: Discontinuity, Concentration, Risk. Selecta Volume E; Springer: New York, NY, USA, 1997; ISBN 978-0-387-98363-9. https://doi.org/10.1007/978-1-4757-2763-0.</w:t>
+      </w:r>
+    </w:p>
+    <w:p>
+      <w:pPr>
+        <w:pStyle w:val="MDPI81references"/>
+      </w:pPr>
+      <w:r>
+        <w:t>4.</w:t>
+        <w:tab/>
+        <w:t>Embrechts, P.; Maejima, M. Selfsimilar Processes; Princeton University Press: Princeton, NJ, USA, 2002; ISBN 978-0-691-09627-8. [DOI da verificare].</w:t>
+      </w:r>
+    </w:p>
+    <w:p>
+      <w:pPr>
+        <w:pStyle w:val="MDPI81references"/>
+      </w:pPr>
+      <w:r>
+        <w:t>5.</w:t>
+        <w:tab/>
+        <w:t xml:space="preserve">Iovane, G.; Laserra, E.; Tortoriello, F.S. Stochastic self-similar and fractal universe. </w:t>
+      </w:r>
+      <w:r>
+        <w:rPr>
+          <w:i/>
+        </w:rPr>
+        <w:t>Chaos Solitons Fract.</w:t>
+      </w:r>
+      <w:r>
+        <w:t xml:space="preserve"> </w:t>
+      </w:r>
+      <w:r>
+        <w:rPr>
+          <w:b/>
+        </w:rPr>
+        <w:t>2004</w:t>
+      </w:r>
+      <w:r>
+        <w:t xml:space="preserve">, </w:t>
+      </w:r>
+      <w:r>
+        <w:rPr>
+          <w:i/>
+        </w:rPr>
+        <w:t>20</w:t>
+      </w:r>
+      <w:r>
+        <w:t>, 415–426. https://doi.org/10.1016/j.chaos.2003.08.004.</w:t>
+      </w:r>
+    </w:p>
+    <w:p>
+      <w:pPr>
+        <w:pStyle w:val="MDPI81references"/>
+      </w:pPr>
+      <w:r>
+        <w:t>6.</w:t>
+        <w:tab/>
+        <w:t>Daubechies, I. Ten Lectures on Wavelets; SIAM: Philadelphia, PA, USA, 1992; ISBN 978-0-89871-274-2. https://doi.org/10.1137/1.9781611970104.</w:t>
+      </w:r>
+    </w:p>
+    <w:p>
+      <w:pPr>
+        <w:pStyle w:val="MDPI81references"/>
+      </w:pPr>
+      <w:r>
+        <w:t>7.</w:t>
+        <w:tab/>
+        <w:t>Mallat, S. A Wavelet Tour of Signal Processing: The Sparse Way, 3rd ed.; Academic Press: Burlington, MA, USA, 2008; ISBN 978-0-12-374370-1. [DOI da verificare].</w:t>
+      </w:r>
+    </w:p>
+    <w:p>
+      <w:pPr>
+        <w:pStyle w:val="MDPI81references"/>
+      </w:pPr>
+      <w:r>
+        <w:t>8.</w:t>
+        <w:tab/>
+        <w:t>Mantegna, R.N.; Stanley, H.E. An Introduction to Econophysics: Correlations and Complexity in Finance; Cambridge University Press: Cambridge, UK, 2000; ISBN 978-0-521-62008-6. https://doi.org/10.1017/CBO9780511755767.</w:t>
+      </w:r>
+    </w:p>
+    <w:p>
+      <w:pPr>
+        <w:pStyle w:val="MDPI81references"/>
+      </w:pPr>
+      <w:r>
+        <w:t>9.</w:t>
+        <w:tab/>
+        <w:t xml:space="preserve">Di Matteo, T. Multi-scaling in finance. </w:t>
+      </w:r>
+      <w:r>
+        <w:rPr>
+          <w:i/>
+        </w:rPr>
+        <w:t>Quant. Finance</w:t>
+      </w:r>
+      <w:r>
+        <w:t xml:space="preserve"> </w:t>
+      </w:r>
+      <w:r>
+        <w:rPr>
+          <w:b/>
+        </w:rPr>
+        <w:t>2007</w:t>
+      </w:r>
+      <w:r>
+        <w:t xml:space="preserve">, </w:t>
+      </w:r>
+      <w:r>
+        <w:rPr>
+          <w:i/>
+        </w:rPr>
+        <w:t>7</w:t>
+      </w:r>
+      <w:r>
+        <w:t>, 21–36. https://doi.org/10.1080/14697680600969727.</w:t>
+      </w:r>
+    </w:p>
+    <w:p>
+      <w:pPr>
+        <w:pStyle w:val="MDPI81references"/>
+      </w:pPr>
+      <w:r>
+        <w:t>10.</w:t>
+        <w:tab/>
+        <w:t xml:space="preserve">Morales, R.; Di Matteo, T.; Aste, T. Non-stationary multifractality in stock returns. </w:t>
+      </w:r>
+      <w:r>
+        <w:rPr>
+          <w:i/>
+        </w:rPr>
+        <w:t>Physica A</w:t>
+      </w:r>
+      <w:r>
+        <w:t xml:space="preserve"> </w:t>
+      </w:r>
+      <w:r>
+        <w:rPr>
+          <w:b/>
+        </w:rPr>
+        <w:t>2013</w:t>
+      </w:r>
+      <w:r>
+        <w:t xml:space="preserve">, </w:t>
+      </w:r>
+      <w:r>
+        <w:rPr>
+          <w:i/>
+        </w:rPr>
+        <w:t>392</w:t>
+      </w:r>
+      <w:r>
+        <w:t>, 6470–6483. https://doi.org/10.1016/j.physa.2013.08.037.</w:t>
+      </w:r>
+    </w:p>
+    <w:p>
+      <w:pPr>
+        <w:pStyle w:val="MDPI81references"/>
+      </w:pPr>
+      <w:r>
+        <w:t>11.</w:t>
+        <w:tab/>
+        <w:t xml:space="preserve">Schwert, G.W. Why does stock market volatility change over time? </w:t>
+      </w:r>
+      <w:r>
+        <w:rPr>
+          <w:i/>
+        </w:rPr>
+        <w:t>J. Finance</w:t>
+      </w:r>
+      <w:r>
+        <w:t xml:space="preserve"> </w:t>
+      </w:r>
+      <w:r>
+        <w:rPr>
+          <w:b/>
+        </w:rPr>
+        <w:t>1989</w:t>
+      </w:r>
+      <w:r>
+        <w:t xml:space="preserve">, </w:t>
+      </w:r>
+      <w:r>
+        <w:rPr>
+          <w:i/>
+        </w:rPr>
+        <w:t>44</w:t>
+      </w:r>
+      <w:r>
+        <w:t>, 1115–1153. https://doi.org/10.1111/j.1540-6261.1989.tb02647.x.</w:t>
+      </w:r>
+    </w:p>
+    <w:p>
+      <w:pPr>
+        <w:pStyle w:val="MDPI81references"/>
+      </w:pPr>
+      <w:r>
+        <w:t>12.</w:t>
+        <w:tab/>
+        <w:t xml:space="preserve">Poon, S.-H.; Granger, C.W.J. Forecasting volatility in financial markets: A review. </w:t>
+      </w:r>
+      <w:r>
+        <w:rPr>
+          <w:i/>
+        </w:rPr>
+        <w:t>J. Econ. Lit.</w:t>
+      </w:r>
+      <w:r>
+        <w:t xml:space="preserve"> </w:t>
+      </w:r>
+      <w:r>
+        <w:rPr>
+          <w:b/>
+        </w:rPr>
+        <w:t>2003</w:t>
+      </w:r>
+      <w:r>
+        <w:t xml:space="preserve">, </w:t>
+      </w:r>
+      <w:r>
+        <w:rPr>
+          <w:i/>
+        </w:rPr>
+        <w:t>41</w:t>
+      </w:r>
+      <w:r>
+        <w:t>, 478–539. https://doi.org/10.1257/002205103765762743.</w:t>
+      </w:r>
+    </w:p>
+    <w:p>
+      <w:pPr>
+        <w:pStyle w:val="MDPI81references"/>
+      </w:pPr>
+      <w:r>
+        <w:t>13.</w:t>
+        <w:tab/>
+        <w:t xml:space="preserve">Hull, J.; White, A. The pricing of options on assets with stochastic volatilities. </w:t>
+      </w:r>
+      <w:r>
+        <w:rPr>
+          <w:i/>
+        </w:rPr>
+        <w:t>J. Finance</w:t>
+      </w:r>
+      <w:r>
+        <w:t xml:space="preserve"> </w:t>
+      </w:r>
+      <w:r>
+        <w:rPr>
+          <w:b/>
+        </w:rPr>
+        <w:t>1987</w:t>
+      </w:r>
+      <w:r>
+        <w:t xml:space="preserve">, </w:t>
+      </w:r>
+      <w:r>
+        <w:rPr>
+          <w:i/>
+        </w:rPr>
+        <w:t>42</w:t>
+      </w:r>
+      <w:r>
+        <w:t>, 281–300. https://doi.org/10.1111/j.1540-6261.1987.tb02568.x.</w:t>
+      </w:r>
+    </w:p>
+    <w:p>
+      <w:pPr>
+        <w:pStyle w:val="MDPI81references"/>
+      </w:pPr>
+      <w:r>
+        <w:t>14.</w:t>
+        <w:tab/>
+        <w:t xml:space="preserve">Bessembinder, H.; Seguin, P.J. Price volatility, trading volume, and market depth: Evidence from futures markets. </w:t>
+      </w:r>
+      <w:r>
+        <w:rPr>
+          <w:i/>
+        </w:rPr>
+        <w:t>J. Financ. Quant. Anal.</w:t>
+      </w:r>
+      <w:r>
+        <w:t xml:space="preserve"> </w:t>
+      </w:r>
+      <w:r>
+        <w:rPr>
+          <w:b/>
+        </w:rPr>
+        <w:t>1993</w:t>
+      </w:r>
+      <w:r>
+        <w:t xml:space="preserve">, </w:t>
+      </w:r>
+      <w:r>
+        <w:rPr>
+          <w:i/>
+        </w:rPr>
+        <w:t>28</w:t>
+      </w:r>
+      <w:r>
+        <w:t>, 21–39. https://doi.org/10.2307/2331149.</w:t>
+      </w:r>
+    </w:p>
+    <w:p>
+      <w:pPr>
+        <w:pStyle w:val="MDPI81references"/>
+      </w:pPr>
+      <w:r>
+        <w:t>15.</w:t>
+        <w:tab/>
+        <w:t>Taleb, N.N. The Black Swan: The Impact of the Highly Improbable; Random House: New York, NY, USA, 2007; ISBN 978-1-4000-6351-2. [DOI da verificare].</w:t>
+      </w:r>
+    </w:p>
+    <w:p>
+      <w:pPr>
+        <w:pStyle w:val="MDPI81references"/>
+      </w:pPr>
+      <w:r>
+        <w:t>16.</w:t>
+        <w:tab/>
+        <w:t xml:space="preserve">Cont, R. Empirical properties of asset returns: Stylized facts and statistical issues. </w:t>
+      </w:r>
+      <w:r>
+        <w:rPr>
+          <w:i/>
+        </w:rPr>
+        <w:t>Quant. Finance</w:t>
+      </w:r>
+      <w:r>
+        <w:t xml:space="preserve"> </w:t>
+      </w:r>
+      <w:r>
+        <w:rPr>
+          <w:b/>
+        </w:rPr>
+        <w:t>2001</w:t>
+      </w:r>
+      <w:r>
+        <w:t xml:space="preserve">, </w:t>
+      </w:r>
+      <w:r>
+        <w:rPr>
+          <w:i/>
+        </w:rPr>
+        <w:t>1</w:t>
+      </w:r>
+      <w:r>
+        <w:t>, 223–236. https://doi.org/10.1080/713665670.</w:t>
+      </w:r>
+    </w:p>
+    <w:p>
+      <w:pPr>
+        <w:pStyle w:val="MDPI81references"/>
+      </w:pPr>
+      <w:r>
+        <w:t>17.</w:t>
+        <w:tab/>
+        <w:t xml:space="preserve">Iovane, G.; Briscione, A.; Benedetto, E. Financion: A quantum approach to financial market modelling. </w:t>
+      </w:r>
+      <w:r>
+        <w:rPr>
+          <w:i/>
+        </w:rPr>
+        <w:t>J. Stat. Manag. Syst.</w:t>
+      </w:r>
+      <w:r>
+        <w:t xml:space="preserve"> </w:t>
+      </w:r>
+      <w:r>
+        <w:rPr>
+          <w:b/>
+        </w:rPr>
+        <w:t>2021</w:t>
+      </w:r>
+      <w:r>
+        <w:t xml:space="preserve">, </w:t>
+      </w:r>
+      <w:r>
+        <w:rPr>
+          <w:i/>
+        </w:rPr>
+        <w:t>24</w:t>
+      </w:r>
+      <w:r>
+        <w:t>, 1127–1149. https://doi.org/10.1080/09720510.2021.1930665.</w:t>
+      </w:r>
+    </w:p>
+    <w:p>
+      <w:pPr>
+        <w:pStyle w:val="MDPI81references"/>
+      </w:pPr>
+      <w:r>
+        <w:t>18.</w:t>
+        <w:tab/>
+        <w:t xml:space="preserve">Iovane, G.; Landi, A.; Serino, S. An optimized mathematical-physical approach to financial market via hierarchy and dynamical systems analysis. </w:t>
+      </w:r>
+      <w:r>
+        <w:rPr>
+          <w:i/>
+        </w:rPr>
+        <w:t>J. Inf. Optim. Sci.</w:t>
+      </w:r>
+      <w:r>
+        <w:t xml:space="preserve"> </w:t>
+      </w:r>
+      <w:r>
+        <w:rPr>
+          <w:b/>
+        </w:rPr>
+        <w:t>2016</w:t>
+      </w:r>
+      <w:r>
+        <w:t xml:space="preserve">, </w:t>
+      </w:r>
+      <w:r>
+        <w:rPr>
+          <w:i/>
+        </w:rPr>
+        <w:t>37</w:t>
+      </w:r>
+      <w:r>
+        <w:t>, 423–448. https://doi.org/10.1080/02522667.2015.1105526.</w:t>
+      </w:r>
+    </w:p>
+    <w:p>
+      <w:pPr>
+        <w:pStyle w:val="MDPI81references"/>
+      </w:pPr>
+      <w:r>
+        <w:t>19.</w:t>
+        <w:tab/>
+        <w:t xml:space="preserve">Iovane, G. Decision support system driven by thermo-complexity: Algorithms and data manipulation. </w:t>
+      </w:r>
+      <w:r>
+        <w:rPr>
+          <w:i/>
+        </w:rPr>
+        <w:t>IEEE Access</w:t>
+      </w:r>
+      <w:r>
+        <w:t xml:space="preserve"> </w:t>
+      </w:r>
+      <w:r>
+        <w:rPr>
+          <w:b/>
+        </w:rPr>
+        <w:t>2024</w:t>
+      </w:r>
+      <w:r>
+        <w:t xml:space="preserve">, </w:t>
+      </w:r>
+      <w:r>
+        <w:rPr>
+          <w:i/>
+        </w:rPr>
+        <w:t>12</w:t>
+      </w:r>
+      <w:r>
+        <w:t>, 157359–157382. https://doi.org/10.1109/ACCESS.2024.3482711.</w:t>
+      </w:r>
+    </w:p>
+    <w:p>
+      <w:pPr>
+        <w:pStyle w:val="MDPI81references"/>
+      </w:pPr>
+      <w:r>
+        <w:t>20.</w:t>
+        <w:tab/>
+        <w:t xml:space="preserve">Iovane, G.; Chinnici, M. Decision support system driven by thermo-complexity: Scenario analysis and data visualization. </w:t>
+      </w:r>
+      <w:r>
+        <w:rPr>
+          <w:i/>
+        </w:rPr>
+        <w:t>Appl. Sci.</w:t>
+      </w:r>
+      <w:r>
+        <w:t xml:space="preserve"> </w:t>
+      </w:r>
+      <w:r>
+        <w:rPr>
+          <w:b/>
+        </w:rPr>
+        <w:t>2024</w:t>
+      </w:r>
+      <w:r>
+        <w:t xml:space="preserve">, </w:t>
+      </w:r>
+      <w:r>
+        <w:rPr>
+          <w:i/>
+        </w:rPr>
+        <w:t>14</w:t>
+      </w:r>
+      <w:r>
+        <w:t>, 2387. https://doi.org/10.3390/app14062387.</w:t>
+      </w:r>
+    </w:p>
+    <w:p>
+      <w:pPr>
+        <w:pStyle w:val="MDPI81references"/>
+      </w:pPr>
+      <w:r>
+        <w:t>21.</w:t>
+        <w:tab/>
+        <w:t xml:space="preserve">Shavandi, A.; Khedmati, M. A multi-agent deep reinforcement learning framework for algorithmic trading in financial markets. </w:t>
+      </w:r>
+      <w:r>
+        <w:rPr>
+          <w:i/>
+        </w:rPr>
+        <w:t>Expert Syst. Appl.</w:t>
+      </w:r>
+      <w:r>
+        <w:t xml:space="preserve"> </w:t>
+      </w:r>
+      <w:r>
+        <w:rPr>
+          <w:b/>
+        </w:rPr>
+        <w:t>2022</w:t>
+      </w:r>
+      <w:r>
+        <w:t xml:space="preserve">, </w:t>
+      </w:r>
+      <w:r>
+        <w:rPr>
+          <w:i/>
+        </w:rPr>
+        <w:t>208</w:t>
+      </w:r>
+      <w:r>
+        <w:t>, 118124. https://doi.org/10.1016/j.eswa.2022.118124.</w:t>
+      </w:r>
+    </w:p>
+    <w:p>
+      <w:pPr>
+        <w:pStyle w:val="MDPI81references"/>
+      </w:pPr>
+      <w:r>
+        <w:t>22.</w:t>
+        <w:tab/>
+        <w:t xml:space="preserve">Wu, X.; Chen, H.; Wang, J.; Troiano, L.; Loia, V.; Fujita, H. Adaptive stock trading strategies with deep reinforcement learning methods. </w:t>
+      </w:r>
+      <w:r>
+        <w:rPr>
+          <w:i/>
+        </w:rPr>
+        <w:t>Inf. Sci.</w:t>
+      </w:r>
+      <w:r>
+        <w:t xml:space="preserve"> </w:t>
+      </w:r>
+      <w:r>
+        <w:rPr>
+          <w:b/>
+        </w:rPr>
+        <w:t>2020</w:t>
+      </w:r>
+      <w:r>
+        <w:t xml:space="preserve">, </w:t>
+      </w:r>
+      <w:r>
+        <w:rPr>
+          <w:i/>
+        </w:rPr>
+        <w:t>538</w:t>
+      </w:r>
+      <w:r>
+        <w:t>, 142–158. https://doi.org/10.1016/j.ins.2020.05.066.</w:t>
+      </w:r>
+    </w:p>
+    <w:p>
+      <w:pPr>
+        <w:pStyle w:val="MDPI81references"/>
+      </w:pPr>
+      <w:r>
+        <w:t>23.</w:t>
+        <w:tab/>
+        <w:t>Hosseini Rad, S.; Tahmasebi Khorasani, S. Cooperative multi-agent deep reinforcement learning for Forex algorithmic trading using Proximal Policy Optimization. In Proceedings of the 2024 20th CSI International Symposium on Artificial Intelligence and Signal Processing (AISP), Mashhad, Iran, 21–22 February 2024. [pagine e DOI da verificare].</w:t>
+      </w:r>
+    </w:p>
+    <w:p>
+      <w:pPr>
+        <w:pStyle w:val="MDPI81references"/>
+      </w:pPr>
+      <w:r>
+        <w:t>24.</w:t>
+        <w:tab/>
+        <w:t>Wooldridge, M. An Introduction to MultiAgent Systems, 2nd ed.; Wiley: Chichester, UK, 2009; ISBN 978-0-470-51946-2. [DOI da verificare].</w:t>
+      </w:r>
+    </w:p>
+    <w:p>
+      <w:pPr>
+        <w:pStyle w:val="MDPI81references"/>
+      </w:pPr>
+      <w:r>
+        <w:t>25.</w:t>
+        <w:tab/>
+        <w:t xml:space="preserve">Xi, Z.; Chen, W.; Guo, X.; He, W.; Ding, Y.; Hong, B.; Zhang, M.; Wang, J.; Jin, S.; Zhou, E.; et al. The rise and potential of large language model based agents: A survey. </w:t>
+      </w:r>
+      <w:r>
+        <w:rPr>
+          <w:i/>
+        </w:rPr>
+        <w:t>Sci. China Inf. Sci.</w:t>
+      </w:r>
+      <w:r>
+        <w:t xml:space="preserve"> </w:t>
+      </w:r>
+      <w:r>
+        <w:rPr>
+          <w:b/>
+        </w:rPr>
+        <w:t>2025</w:t>
+      </w:r>
+      <w:r>
+        <w:t xml:space="preserve">, </w:t>
+      </w:r>
+      <w:r>
+        <w:rPr>
+          <w:i/>
+        </w:rPr>
+        <w:t>68</w:t>
+      </w:r>
+      <w:r>
+        <w:t>, 121101. https://doi.org/10.1007/s11432-024-4222-0.</w:t>
+      </w:r>
+    </w:p>
+    <w:p>
+      <w:pPr>
+        <w:pStyle w:val="MDPI81references"/>
+      </w:pPr>
+      <w:r>
+        <w:t>26.</w:t>
+        <w:tab/>
+        <w:t>Du, Y.; Li, S.; Torralba, A.; Tenenbaum, J.B.; Mordatch, I. Improving factuality and reasoning in language models through multiagent debate. In Proceedings of the 41st International Conference on Machine Learning (ICML 2024), Vienna, Austria, 21–27 July 2024; PMLR: Vienna, Austria, 2024.</w:t>
+      </w:r>
+    </w:p>
+    <w:p>
+      <w:pPr>
+        <w:pStyle w:val="MDPI81references"/>
+      </w:pPr>
+      <w:r>
+        <w:t>27.</w:t>
+        <w:tab/>
+        <w:t xml:space="preserve">Wei, J.; Wang, X.; Schuurmans, D.; Bosma, M.; Ichter, B.; Xia, F.; Chi, E.H.; Le, Q.V.; Zhou, D. Chain-of-thought prompting elicits reasoning in large language models. </w:t>
+      </w:r>
+      <w:r>
+        <w:rPr>
+          <w:i/>
+        </w:rPr>
+        <w:t>Adv. Neural Inf. Process. Syst.</w:t>
+      </w:r>
+      <w:r>
+        <w:t xml:space="preserve"> </w:t>
+      </w:r>
+      <w:r>
+        <w:rPr>
+          <w:b/>
+        </w:rPr>
+        <w:t>2022</w:t>
+      </w:r>
+      <w:r>
+        <w:t xml:space="preserve">, </w:t>
+      </w:r>
+      <w:r>
+        <w:rPr>
+          <w:i/>
+        </w:rPr>
+        <w:t>35</w:t>
+      </w:r>
+      <w:r>
+        <w:t>, 24824–24837. https://doi.org/10.48550/arXiv.2201.11903.</w:t>
+      </w:r>
+    </w:p>
+    <w:p>
+      <w:pPr>
+        <w:pStyle w:val="MDPI81references"/>
+      </w:pPr>
+      <w:r>
+        <w:t>28.</w:t>
+        <w:tab/>
+        <w:t>Yao, S.; Zhao, J.; Yu, D.; Du, N.; Shafran, I.; Narasimhan, K.; Cao, Y. ReAct: Synergizing reasoning and acting in language models. In Proceedings of the Eleventh International Conference on Learning Representations (ICLR 2023), Kigali, Rwanda, 1–5 May 2023. https://doi.org/10.48550/arXiv.2210.03629.</w:t>
+      </w:r>
+    </w:p>
+    <w:p>
+      <w:pPr>
+        <w:pStyle w:val="MDPI81references"/>
+      </w:pPr>
+      <w:r>
+        <w:t>29.</w:t>
+        <w:tab/>
+        <w:t xml:space="preserve">Jaynes, E.T. Information theory and statistical mechanics. </w:t>
+      </w:r>
+      <w:r>
+        <w:rPr>
+          <w:i/>
+        </w:rPr>
+        <w:t>Phys. Rev.</w:t>
+      </w:r>
+      <w:r>
+        <w:t xml:space="preserve"> </w:t>
+      </w:r>
+      <w:r>
+        <w:rPr>
+          <w:b/>
+        </w:rPr>
+        <w:t>1957</w:t>
+      </w:r>
+      <w:r>
+        <w:t xml:space="preserve">, </w:t>
+      </w:r>
+      <w:r>
+        <w:rPr>
+          <w:i/>
+        </w:rPr>
+        <w:t>106</w:t>
+      </w:r>
+      <w:r>
+        <w:t>, 620–630. https://doi.org/10.1103/PhysRev.106.620.</w:t>
+      </w:r>
+    </w:p>
+    <w:p>
+      <w:pPr>
+        <w:pStyle w:val="MDPI81references"/>
+      </w:pPr>
+      <w:r>
+        <w:t>30.</w:t>
+        <w:tab/>
+        <w:t xml:space="preserve">Kahneman, D.; Tversky, A. Prospect theory: An analysis of decision under risk. </w:t>
+      </w:r>
+      <w:r>
+        <w:rPr>
+          <w:i/>
+        </w:rPr>
+        <w:t>Econometrica</w:t>
+      </w:r>
+      <w:r>
+        <w:t xml:space="preserve"> </w:t>
+      </w:r>
+      <w:r>
+        <w:rPr>
+          <w:b/>
+        </w:rPr>
+        <w:t>1979</w:t>
+      </w:r>
+      <w:r>
+        <w:t xml:space="preserve">, </w:t>
+      </w:r>
+      <w:r>
+        <w:rPr>
+          <w:i/>
+        </w:rPr>
+        <w:t>47</w:t>
+      </w:r>
+      <w:r>
+        <w:t>, 263–292. https://doi.org/10.2307/1914185.</w:t>
+      </w:r>
+    </w:p>
+    <w:p>
+      <w:pPr>
+        <w:pStyle w:val="MDPI81references"/>
+      </w:pPr>
+      <w:r>
+        <w:t>31.</w:t>
+        <w:tab/>
+        <w:t xml:space="preserve">Iovane, G.; Di Gironimo, P.; Chinnici, M.; Rapuano, A. Decision and reasoning in incompleteness or uncertainty conditions. </w:t>
+      </w:r>
+      <w:r>
+        <w:rPr>
+          <w:i/>
+        </w:rPr>
+        <w:t>IEEE Access</w:t>
+      </w:r>
+      <w:r>
+        <w:t xml:space="preserve"> </w:t>
+      </w:r>
+      <w:r>
+        <w:rPr>
+          <w:b/>
+        </w:rPr>
+        <w:t>2020</w:t>
+      </w:r>
+      <w:r>
+        <w:t xml:space="preserve">, </w:t>
+      </w:r>
+      <w:r>
+        <w:rPr>
+          <w:i/>
+        </w:rPr>
+        <w:t>8</w:t>
+      </w:r>
+      <w:r>
+        <w:t>, 115109–115122. https://doi.org/10.1109/ACCESS.2020.3003726.</w:t>
+      </w:r>
+    </w:p>
+    <w:p>
+      <w:pPr>
+        <w:pStyle w:val="MDPI81references"/>
+      </w:pPr>
+      <w:r>
+        <w:t>32.</w:t>
+        <w:tab/>
+        <w:t xml:space="preserve">Iovane, G.; Landi, R.E.; Rapuano, A.; Amatore, R. Assessing the relevance of opinions in uncertainty and info-incompleteness conditions. </w:t>
+      </w:r>
+      <w:r>
+        <w:rPr>
+          <w:i/>
+        </w:rPr>
+        <w:t>Appl. Sci.</w:t>
+      </w:r>
+      <w:r>
+        <w:t xml:space="preserve"> </w:t>
+      </w:r>
+      <w:r>
+        <w:rPr>
+          <w:b/>
+        </w:rPr>
+        <w:t>2022</w:t>
+      </w:r>
+      <w:r>
+        <w:t xml:space="preserve">, </w:t>
+      </w:r>
+      <w:r>
+        <w:rPr>
+          <w:i/>
+        </w:rPr>
+        <w:t>12</w:t>
+      </w:r>
+      <w:r>
+        <w:t>, 194. https://doi.org/10.3390/app12010194.</w:t>
+      </w:r>
+    </w:p>
+    <w:p>
+      <w:pPr>
+        <w:pStyle w:val="MDPI81references"/>
+      </w:pPr>
+      <w:r>
+        <w:t>33.</w:t>
+        <w:tab/>
+        <w:t>Cover, T.M.; Thomas, J.A. Elements of Information Theory, 2nd ed.; Wiley-Interscience: Hoboken, NJ, USA, 2006; ISBN 978-0-471-24195-9. [DOI da verificare].</w:t>
+      </w:r>
+    </w:p>
+    <w:p>
+      <w:pPr>
+        <w:pStyle w:val="MDPI81references"/>
+      </w:pPr>
+      <w:r>
+        <w:t>34.</w:t>
+        <w:tab/>
+        <w:t xml:space="preserve">European Parliament and Council. Regulation (EU) 2024/1689 laying down harmonised rules on artificial intelligence (Artificial Intelligence Act). </w:t>
+      </w:r>
+      <w:r>
+        <w:rPr>
+          <w:i/>
+        </w:rPr>
+        <w:t>Off. J. Eur. Union</w:t>
+      </w:r>
+      <w:r>
+        <w:t xml:space="preserve"> </w:t>
+      </w:r>
+      <w:r>
+        <w:rPr>
+          <w:b/>
+        </w:rPr>
+        <w:t>2024</w:t>
+      </w:r>
+      <w:r>
+        <w:t>. Available online: https://eur-lex.europa.eu/eli/reg/2024/1689/oj (accessed on 30 April 2026).</w:t>
+      </w:r>
+    </w:p>
+    <w:p>
+      <w:pPr>
+        <w:pStyle w:val="MDPI81references"/>
+      </w:pPr>
+      <w:r>
+        <w:t>35.</w:t>
+        <w:tab/>
+        <w:t>Peters, E.E. Fractal Market Analysis: Applying Chaos Theory to Investment and Economics; Wiley: New York, NY, USA, 1994; ISBN 978-0-471-58524-4. [DOI da verificare].</w:t>
+      </w:r>
+    </w:p>
+    <w:p>
+      <w:pPr>
+        <w:pStyle w:val="MDPI81references"/>
+      </w:pPr>
+      <w:r>
+        <w:t>36.</w:t>
+        <w:tab/>
+        <w:t xml:space="preserve">Deng, Y.; Bao, F.; Kong, Y.; Ren, Z.; Dai, Q. Deep direct reinforcement learning for financial signal representation and trading. </w:t>
+      </w:r>
+      <w:r>
+        <w:rPr>
+          <w:i/>
+        </w:rPr>
+        <w:t>IEEE Trans. Neural Netw. Learn. Syst.</w:t>
+      </w:r>
+      <w:r>
+        <w:t xml:space="preserve"> </w:t>
+      </w:r>
+      <w:r>
+        <w:rPr>
+          <w:b/>
+        </w:rPr>
+        <w:t>2017</w:t>
+      </w:r>
+      <w:r>
+        <w:t xml:space="preserve">, </w:t>
+      </w:r>
+      <w:r>
+        <w:rPr>
+          <w:i/>
+        </w:rPr>
+        <w:t>28</w:t>
+      </w:r>
+      <w:r>
+        <w:t>, 653–664. https://doi.org/10.1109/TNNLS.2016.2522401.</w:t>
+      </w:r>
+    </w:p>
+    <w:p>
+      <w:pPr>
+        <w:pStyle w:val="MDPI81references"/>
+      </w:pPr>
+      <w:r>
+        <w:t>37.</w:t>
+        <w:tab/>
+        <w:t xml:space="preserve">Moody, J.; Saffell, M. Learning to trade via direct reinforcement. </w:t>
+      </w:r>
+      <w:r>
+        <w:rPr>
+          <w:i/>
+        </w:rPr>
+        <w:t>IEEE Trans. Neural Netw.</w:t>
+      </w:r>
+      <w:r>
+        <w:t xml:space="preserve"> </w:t>
+      </w:r>
+      <w:r>
+        <w:rPr>
+          <w:b/>
+        </w:rPr>
+        <w:t>2001</w:t>
+      </w:r>
+      <w:r>
+        <w:t xml:space="preserve">, </w:t>
+      </w:r>
+      <w:r>
+        <w:rPr>
+          <w:i/>
+        </w:rPr>
+        <w:t>12</w:t>
+      </w:r>
+      <w:r>
+        <w:t>, 875–889. https://doi.org/10.1109/72.935097.</w:t>
+      </w:r>
+    </w:p>
+    <w:p>
+      <w:pPr>
+        <w:pStyle w:val="MDPI81references"/>
+      </w:pPr>
+      <w:r>
+        <w:t>38.</w:t>
+        <w:tab/>
+        <w:t>Blackledge, J.M.; Murphy, K. Currency trading using the fractal market hypothesis. In Risk Management Trends; Nota, G., Ed.; IntechOpen: London, UK, 2011; ISBN 978-953-307-314-9. https://doi.org/10.5772/16249.</w:t>
+      </w:r>
+    </w:p>
+    <w:p>
+      <w:pPr>
+        <w:pStyle w:val="MDPI81references"/>
+      </w:pPr>
+      <w:r>
+        <w:t>39.</w:t>
+        <w:tab/>
+        <w:t>Dacorogna, M.M.; Gençay, R.; Müller, U.; Olsen, R.B.; Pictet, O.V. An Introduction to High-Frequency Finance; Academic Press: San Diego, CA, USA, 2001; ISBN 978-0-12-279671-5. [DOI da verificare].</w:t>
+      </w:r>
+    </w:p>
+    <w:p>
+      <w:pPr>
+        <w:pStyle w:val="MDPI22heading2"/>
+      </w:pPr>
+      <w:r>
+        <w:t>4.B. In-text citation renumbering</w:t>
+      </w:r>
+    </w:p>
+    <w:p>
+      <w:pPr>
+        <w:pStyle w:val="MDPI31text"/>
+      </w:pPr>
+      <w:r>
+        <w:rPr>
+          <w:b/>
+        </w:rPr>
+        <w:t xml:space="preserve">Action 4.B — Replace in-text citation tokens. </w:t>
+      </w:r>
+      <w:r>
+        <w:t>After the bibliography is rewritten, the following in-text citations must be updated. References [1]–[31] are unchanged. References [32]–[39] (the new numbering) correspond to old [33]–[40]. All other in-text citations are unaffected.</w:t>
+      </w:r>
+    </w:p>
+    <w:tbl>
+      <w:tblPr>
+        <w:tblStyle w:val="MDPI41threelinetable"/>
+        <w:tblW w:type="auto" w:w="0"/>
+        <w:tblLook w:firstColumn="1" w:firstRow="1" w:lastColumn="0" w:lastRow="0" w:noHBand="0" w:noVBand="1" w:val="04A0"/>
+      </w:tblPr>
+      <w:tblGrid>
+        <w:gridCol w:w="2616"/>
+        <w:gridCol w:w="2616"/>
+        <w:gridCol w:w="2616"/>
+        <w:gridCol w:w="2616"/>
+      </w:tblGrid>
+      <w:tr>
+        <w:tc>
+          <w:tcPr>
+            <w:tcW w:type="dxa" w:w="2616"/>
+          </w:tcPr>
+          <w:p>
+            <w:r>
+              <w:rPr>
+                <w:b/>
+              </w:rPr>
+              <w:t>Paragraph</w:t>
+            </w:r>
+          </w:p>
+        </w:tc>
+        <w:tc>
+          <w:tcPr>
+            <w:tcW w:type="dxa" w:w="2616"/>
+          </w:tcPr>
+          <w:p>
+            <w:r>
+              <w:rPr>
+                <w:b/>
+              </w:rPr>
+              <w:t>Old citation</w:t>
+            </w:r>
+          </w:p>
+        </w:tc>
+        <w:tc>
+          <w:tcPr>
+            <w:tcW w:type="dxa" w:w="2616"/>
+          </w:tcPr>
+          <w:p>
+            <w:r>
+              <w:rPr>
+                <w:b/>
+              </w:rPr>
+              <w:t>New citation</w:t>
+            </w:r>
+          </w:p>
+        </w:tc>
+        <w:tc>
+          <w:tcPr>
+            <w:tcW w:type="dxa" w:w="2616"/>
+          </w:tcPr>
+          <w:p>
+            <w:r>
+              <w:rPr>
+                <w:b/>
+              </w:rPr>
+              <w:t>Note</w:t>
+            </w:r>
+          </w:p>
+        </w:tc>
+      </w:tr>
+      <w:tr>
+        <w:tc>
+          <w:tcPr>
+            <w:tcW w:type="dxa" w:w="2616"/>
+          </w:tcPr>
+          <w:p>
+            <w:r>
+              <w:t>P40</w:t>
+            </w:r>
+          </w:p>
+        </w:tc>
+        <w:tc>
+          <w:tcPr>
+            <w:tcW w:type="dxa" w:w="2616"/>
+          </w:tcPr>
+          <w:p>
+            <w:r>
+              <w:t>[31–33]</w:t>
+            </w:r>
+          </w:p>
+        </w:tc>
+        <w:tc>
+          <w:tcPr>
+            <w:tcW w:type="dxa" w:w="2616"/>
+          </w:tcPr>
+          <w:p>
+            <w:r>
+              <w:t>[31,32]</w:t>
+            </w:r>
+          </w:p>
+        </w:tc>
+        <w:tc>
+          <w:tcPr>
+            <w:tcW w:type="dxa" w:w="2616"/>
+          </w:tcPr>
+          <w:p>
+            <w:r>
+              <w:t>After removal of old [32], the range covers only two consecutive items (31 and old 33→new 32); rewrite as a two-item list.</w:t>
+            </w:r>
+          </w:p>
+        </w:tc>
+      </w:tr>
+      <w:tr>
+        <w:tc>
+          <w:tcPr>
+            <w:tcW w:type="dxa" w:w="2616"/>
+          </w:tcPr>
+          <w:p>
+            <w:r>
+              <w:t>P66</w:t>
+            </w:r>
+          </w:p>
+        </w:tc>
+        <w:tc>
+          <w:tcPr>
+            <w:tcW w:type="dxa" w:w="2616"/>
+          </w:tcPr>
+          <w:p>
+            <w:r>
+              <w:t>[34]</w:t>
+            </w:r>
+          </w:p>
+        </w:tc>
+        <w:tc>
+          <w:tcPr>
+            <w:tcW w:type="dxa" w:w="2616"/>
+          </w:tcPr>
+          <w:p>
+            <w:r>
+              <w:t>[33]</w:t>
+            </w:r>
+          </w:p>
+        </w:tc>
+        <w:tc>
+          <w:tcPr>
+            <w:tcW w:type="dxa" w:w="2616"/>
+          </w:tcPr>
+          <w:p>
+            <w:r>
+              <w:t>old [34] (Cover &amp; Thomas) → new [33]</w:t>
+            </w:r>
+          </w:p>
+        </w:tc>
+      </w:tr>
+      <w:tr>
+        <w:tc>
+          <w:tcPr>
+            <w:tcW w:type="dxa" w:w="2616"/>
+          </w:tcPr>
+          <w:p>
+            <w:r>
+              <w:t>P94</w:t>
+            </w:r>
+          </w:p>
+        </w:tc>
+        <w:tc>
+          <w:tcPr>
+            <w:tcW w:type="dxa" w:w="2616"/>
+          </w:tcPr>
+          <w:p>
+            <w:r>
+              <w:t>[35]</w:t>
+            </w:r>
+          </w:p>
+        </w:tc>
+        <w:tc>
+          <w:tcPr>
+            <w:tcW w:type="dxa" w:w="2616"/>
+          </w:tcPr>
+          <w:p>
+            <w:r>
+              <w:t>[34]</w:t>
+            </w:r>
+          </w:p>
+        </w:tc>
+        <w:tc>
+          <w:tcPr>
+            <w:tcW w:type="dxa" w:w="2616"/>
+          </w:tcPr>
+          <w:p>
+            <w:r>
+              <w:t>old [35] (AI Act, Reg. EU 2024/1689) → new [34]</w:t>
+            </w:r>
+          </w:p>
+        </w:tc>
+      </w:tr>
+      <w:tr>
+        <w:tc>
+          <w:tcPr>
+            <w:tcW w:type="dxa" w:w="2616"/>
+          </w:tcPr>
+          <w:p>
+            <w:r>
+              <w:t>P129</w:t>
+            </w:r>
+          </w:p>
+        </w:tc>
+        <w:tc>
+          <w:tcPr>
+            <w:tcW w:type="dxa" w:w="2616"/>
+          </w:tcPr>
+          <w:p>
+            <w:r>
+              <w:t>[36]</w:t>
+            </w:r>
+          </w:p>
+        </w:tc>
+        <w:tc>
+          <w:tcPr>
+            <w:tcW w:type="dxa" w:w="2616"/>
+          </w:tcPr>
+          <w:p>
+            <w:r>
+              <w:t>[35]</w:t>
+            </w:r>
+          </w:p>
+        </w:tc>
+        <w:tc>
+          <w:tcPr>
+            <w:tcW w:type="dxa" w:w="2616"/>
+          </w:tcPr>
+          <w:p>
+            <w:r>
+              <w:t>old [36] (Peters) → new [35]</w:t>
+            </w:r>
+          </w:p>
+        </w:tc>
+      </w:tr>
+      <w:tr>
+        <w:tc>
+          <w:tcPr>
+            <w:tcW w:type="dxa" w:w="2616"/>
+          </w:tcPr>
+          <w:p>
+            <w:r>
+              <w:t>P182</w:t>
+            </w:r>
+          </w:p>
+        </w:tc>
+        <w:tc>
+          <w:tcPr>
+            <w:tcW w:type="dxa" w:w="2616"/>
+          </w:tcPr>
+          <w:p>
+            <w:r>
+              <w:t>[37,38]</w:t>
+            </w:r>
+          </w:p>
+        </w:tc>
+        <w:tc>
+          <w:tcPr>
+            <w:tcW w:type="dxa" w:w="2616"/>
+          </w:tcPr>
+          <w:p>
+            <w:r>
+              <w:t>[36,37]</w:t>
+            </w:r>
+          </w:p>
+        </w:tc>
+        <w:tc>
+          <w:tcPr>
+            <w:tcW w:type="dxa" w:w="2616"/>
+          </w:tcPr>
+          <w:p>
+            <w:r>
+              <w:t>old [37] (Deng et al.) → new [36]; old [38] (Moody &amp; Saffell) → new [37]</w:t>
+            </w:r>
+          </w:p>
+        </w:tc>
+      </w:tr>
+      <w:tr>
+        <w:tc>
+          <w:tcPr>
+            <w:tcW w:type="dxa" w:w="2616"/>
+          </w:tcPr>
+          <w:p>
+            <w:r>
+              <w:t>P182</w:t>
+            </w:r>
+          </w:p>
+        </w:tc>
+        <w:tc>
+          <w:tcPr>
+            <w:tcW w:type="dxa" w:w="2616"/>
+          </w:tcPr>
+          <w:p>
+            <w:r>
+              <w:t>[39,40]</w:t>
+            </w:r>
+          </w:p>
+        </w:tc>
+        <w:tc>
+          <w:tcPr>
+            <w:tcW w:type="dxa" w:w="2616"/>
+          </w:tcPr>
+          <w:p>
+            <w:r>
+              <w:t>[38,39]</w:t>
+            </w:r>
+          </w:p>
+        </w:tc>
+        <w:tc>
+          <w:tcPr>
+            <w:tcW w:type="dxa" w:w="2616"/>
+          </w:tcPr>
+          <w:p>
+            <w:r>
+              <w:t>old [39] (Blackledge &amp; Murphy) → new [38]; old [40] (Dacorogna et al.) → new [39]</w:t>
+            </w:r>
+          </w:p>
+        </w:tc>
+      </w:tr>
+    </w:tbl>
+    <w:p>
+      <w:pPr>
+        <w:pStyle w:val="MDPI31text"/>
+      </w:pPr>
+      <w:r>
+        <w:rPr>
+          <w:b/>
+        </w:rPr>
+        <w:t xml:space="preserve">Note. </w:t>
+      </w:r>
+      <w:r>
+        <w:t>All other citations in the manuscript ([1]–[31]) keep the same number. Verify in particular that the ranges [8–16], [21–24] and [25–28] remain intact, since they involve only references whose numbers are unchanged.</w:t>
+      </w:r>
+    </w:p>
+    <w:p>
+      <w:pPr>
+        <w:pStyle w:val="MDPI22heading2"/>
+      </w:pPr>
+      <w:r>
+        <w:t>4.C. Application checklist (replaces previous checklist)</w:t>
+      </w:r>
+    </w:p>
+    <w:p>
+      <w:pPr>
+        <w:pStyle w:val="MDPI37itemize"/>
+      </w:pPr>
+      <w:r>
+        <w:t>1. Open MRQF_MAS_Electronics_GDP_Final.docx.</w:t>
+      </w:r>
+    </w:p>
+    <w:p>
+      <w:pPr>
+        <w:pStyle w:val="MDPI37itemize"/>
+      </w:pPr>
+      <w:r>
+        <w:t>2. Apply Corrections 1, 2 and 3 as previously specified.</w:t>
+      </w:r>
+    </w:p>
+    <w:p>
+      <w:pPr>
+        <w:pStyle w:val="MDPI37itemize"/>
+      </w:pPr>
+      <w:r>
+        <w:t>3. In the References section (P219+), remove all 40 numbered entries and paste the 39 new entries from Section 4.A. Each entry uses style MDPI_8.1_references; preserve italics and bold as shown.</w:t>
+      </w:r>
+    </w:p>
+    <w:p>
+      <w:pPr>
+        <w:pStyle w:val="MDPI37itemize"/>
+      </w:pPr>
+      <w:r>
+        <w:t>4. Apply the in-text replacements listed in Section 4.B (six changes only, all in paragraphs P40, P66, P94, P129 and P182).</w:t>
+      </w:r>
+    </w:p>
+    <w:p>
+      <w:pPr>
+        <w:pStyle w:val="MDPI37itemize"/>
+      </w:pPr>
+      <w:r>
+        <w:t>5. Resolve the [DOI da verificare] tags by looking up the official DOIs for entries 4, 7, 15, 24, 33, 35 and 39, and the missing pages/DOI for entry 23, before submission.</w:t>
+      </w:r>
+    </w:p>
+    <w:p>
+      <w:pPr>
+        <w:pStyle w:val="MDPI37itemize"/>
+      </w:pPr>
+      <w:r>
+        <w:t>6. Run a final check that no [N] citation in the body still refers to a number greater than 39, and that no reference number is unused.</w:t>
       </w:r>
     </w:p>
     <w:sectPr>

</xml_diff>